<commit_message>
Cambiar correo de contacto a info@qerub.com
- info@qerub.com en web, páginas legales y recursos descargables
- Rellenado el correo de ejercicio de derechos en la política de privacidad

Co-Authored-By: Claude Opus 4.8 <noreply@anthropic.com>
</commit_message>
<xml_diff>
--- a/resources/plantilla-respuesta-incidentes-qerub.docx
+++ b/resources/plantilla-respuesta-incidentes-qerub.docx
@@ -615,7 +615,7 @@
               <w:rPr>
                 <w:sz w:val="19"/>
               </w:rPr>
-              <w:t>hola@qerub.com</w:t>
+              <w:t>info@qerub.com</w:t>
             </w:r>
           </w:p>
         </w:tc>
@@ -1620,7 +1620,7 @@
           <w:color w:val="8A6516"/>
           <w:sz w:val="18"/>
         </w:rPr>
-        <w:t>Qerub puede ensayar este playbook contigo (drill de incidentes, servicio Q-Continuity) y dejar las evidencias listas para auditoría o NIS2. hola@qerub.com</w:t>
+        <w:t>Qerub puede ensayar este playbook contigo (drill de incidentes, servicio Q-Continuity) y dejar las evidencias listas para auditoría o NIS2. info@qerub.com</w:t>
       </w:r>
     </w:p>
     <w:sectPr>

</xml_diff>

<commit_message>
Recursos descargables con marca completa, listos para distribución
- Logo, Titillium/Montserrat/JetBrains Mono (TTF del propio sitio) en los PDF
- Eliminado el pie de 'Borrador': son versiones finales de distribución
- Checklist con línea de puntuación /32; bloques CTA hacia Q-Start,
  Q-Dark Watch, Q-Mail Shield y Q-Continuity
- Plantilla DOCX con cabecera de marca e instrucciones de uso

Co-Authored-By: Claude Fable 5 <noreply@anthropic.com>
</commit_message>
<xml_diff>
--- a/resources/plantilla-respuesta-incidentes-qerub.docx
+++ b/resources/plantilla-respuesta-incidentes-qerub.docx
@@ -4,10 +4,47 @@
   <w:body>
     <w:p>
       <w:r>
+        <w:drawing>
+          <wp:inline xmlns:a="http://schemas.openxmlformats.org/drawingml/2006/main" xmlns:pic="http://schemas.openxmlformats.org/drawingml/2006/picture">
+            <wp:extent cx="252000" cy="252000"/>
+            <wp:docPr id="1" name="Picture 1"/>
+            <wp:cNvGraphicFramePr>
+              <a:graphicFrameLocks noChangeAspect="1"/>
+            </wp:cNvGraphicFramePr>
+            <a:graphic>
+              <a:graphicData uri="http://schemas.openxmlformats.org/drawingml/2006/picture">
+                <pic:pic>
+                  <pic:nvPicPr>
+                    <pic:cNvPr id="0" name="qerub-icon.png"/>
+                    <pic:cNvPicPr/>
+                  </pic:nvPicPr>
+                  <pic:blipFill>
+                    <a:blip r:embed="rId9"/>
+                    <a:stretch>
+                      <a:fillRect/>
+                    </a:stretch>
+                  </pic:blipFill>
+                  <pic:spPr>
+                    <a:xfrm>
+                      <a:off x="0" y="0"/>
+                      <a:ext cx="252000" cy="252000"/>
+                    </a:xfrm>
+                    <a:prstGeom prst="rect"/>
+                  </pic:spPr>
+                </pic:pic>
+              </a:graphicData>
+            </a:graphic>
+          </wp:inline>
+        </w:drawing>
+      </w:r>
+      <w:r>
+        <w:t xml:space="preserve">  </w:t>
+      </w:r>
+      <w:r>
         <w:rPr>
           <w:b/>
           <w:color w:val="0E1416"/>
-          <w:sz w:val="26"/>
+          <w:sz w:val="28"/>
         </w:rPr>
         <w:t>Qerub</w:t>
       </w:r>
@@ -16,7 +53,7 @@
           <w:color w:val="4D7E8A"/>
           <w:sz w:val="16"/>
         </w:rPr>
-        <w:t xml:space="preserve">   · ciberseguridad práctica</w:t>
+        <w:t xml:space="preserve">   ciberseguridad práctica para pymes · qerub.com</w:t>
       </w:r>
     </w:p>
     <w:p>
@@ -41,11 +78,9 @@
     <w:p>
       <w:r>
         <w:rPr>
-          <w:i/>
-          <w:color w:val="8A6516"/>
-          <w:sz w:val="18"/>
+          <w:sz w:val="20"/>
         </w:rPr>
-        <w:t>Borrador — complétalo y revísalo con tu responsable de seguridad antes de darlo por válido.</w:t>
+        <w:t>Cómo usar esta plantilla: complétala con tu responsable de seguridad (interno o externo), revísala cada 6 meses y pruébala al menos una vez al año con un simulacro de mesa.</w:t>
       </w:r>
     </w:p>
     <w:p>
@@ -1617,10 +1652,10 @@
       <w:r>
         <w:rPr>
           <w:i/>
-          <w:color w:val="8A6516"/>
+          <w:color w:val="4D7E8A"/>
           <w:sz w:val="18"/>
         </w:rPr>
-        <w:t>Qerub puede ensayar este playbook contigo (drill de incidentes, servicio Q-Continuity) y dejar las evidencias listas para auditoría o NIS2. info@qerub.com</w:t>
+        <w:t>¿Quieres ensayarlo antes del día malo? Qerub prueba este playbook contigo (drill de incidentes del servicio Q-Continuity) y deja las evidencias listas para auditoría o NIS2. — qerub.com · info@qerub.com · +34 615 60 07 07</w:t>
       </w:r>
     </w:p>
     <w:sectPr>

</xml_diff>